<commit_message>
update the meetings for deliverable 2
</commit_message>
<xml_diff>
--- a/IoT_grp9_Meeting_Minutes.docx
+++ b/IoT_grp9_Meeting_Minutes.docx
@@ -83,13 +83,7 @@
       </w:r>
       <w:proofErr w:type="spellEnd"/>
       <w:r>
-        <w:t xml:space="preserve"> </w:t>
-      </w:r>
-      <w:r>
-        <w:t xml:space="preserve">- </w:t>
-      </w:r>
-      <w:r>
-        <w:t xml:space="preserve">169391 </w:t>
+        <w:t xml:space="preserve"> - 169391 </w:t>
       </w:r>
     </w:p>
     <w:p>
@@ -101,13 +95,7 @@
         </w:numPr>
       </w:pPr>
       <w:r>
-        <w:t xml:space="preserve">Glenn Karenju </w:t>
-      </w:r>
-      <w:r>
-        <w:t xml:space="preserve">- </w:t>
-      </w:r>
-      <w:r>
-        <w:t>109511</w:t>
+        <w:t>Glenn Karenju - 109511</w:t>
       </w:r>
     </w:p>
     <w:p>
@@ -119,13 +107,7 @@
         </w:numPr>
       </w:pPr>
       <w:r>
-        <w:t xml:space="preserve">Lawry Abuna </w:t>
-      </w:r>
-      <w:r>
-        <w:t xml:space="preserve">- </w:t>
-      </w:r>
-      <w:r>
-        <w:t>161000</w:t>
+        <w:t>Lawry Abuna - 161000</w:t>
       </w:r>
     </w:p>
     <w:p>
@@ -145,13 +127,7 @@
       </w:r>
       <w:proofErr w:type="spellEnd"/>
       <w:r>
-        <w:t xml:space="preserve"> </w:t>
-      </w:r>
-      <w:r>
-        <w:t xml:space="preserve">- </w:t>
-      </w:r>
-      <w:r>
-        <w:t>158270</w:t>
+        <w:t xml:space="preserve"> - 158270</w:t>
       </w:r>
     </w:p>
     <w:p>
@@ -163,13 +139,7 @@
         </w:numPr>
       </w:pPr>
       <w:r>
-        <w:t xml:space="preserve">Larry Seme </w:t>
-      </w:r>
-      <w:r>
-        <w:t xml:space="preserve">- </w:t>
-      </w:r>
-      <w:r>
-        <w:t>169002</w:t>
+        <w:t>Larry Seme - 169002</w:t>
       </w:r>
     </w:p>
     <w:p>
@@ -189,13 +159,7 @@
       </w:r>
       <w:proofErr w:type="spellEnd"/>
       <w:r>
-        <w:t xml:space="preserve"> </w:t>
-      </w:r>
-      <w:r>
-        <w:t xml:space="preserve">- </w:t>
-      </w:r>
-      <w:r>
-        <w:t>151785</w:t>
+        <w:t xml:space="preserve"> - 151785</w:t>
       </w:r>
     </w:p>
     <w:p>
@@ -207,13 +171,7 @@
         </w:numPr>
       </w:pPr>
       <w:r>
-        <w:t xml:space="preserve">Alvin Kimani </w:t>
-      </w:r>
-      <w:r>
-        <w:t xml:space="preserve">- </w:t>
-      </w:r>
-      <w:r>
-        <w:t>167148</w:t>
+        <w:t>Alvin Kimani - 167148</w:t>
       </w:r>
     </w:p>
     <w:p>
@@ -275,145 +233,92 @@
         <w:t>Time:</w:t>
       </w:r>
       <w:r>
+        <w:t xml:space="preserve"> Class Perio</w:t>
+      </w:r>
+      <w:r>
+        <w:t>d</w:t>
+      </w:r>
+      <w:r>
+        <w:t>, 2:15 PM – 4:15 PM</w:t>
+      </w:r>
+    </w:p>
+    <w:p>
+      <w:pPr>
+        <w:spacing w:after="0"/>
+      </w:pPr>
+      <w:r>
+        <w:rPr>
+          <w:b/>
+          <w:bCs/>
+        </w:rPr>
+        <w:t>Venue:</w:t>
+      </w:r>
+      <w:r>
+        <w:t xml:space="preserve"> Virtual</w:t>
+      </w:r>
+      <w:r>
         <w:t xml:space="preserve"> </w:t>
       </w:r>
       <w:r>
-        <w:t>Class Perio</w:t>
+        <w:t xml:space="preserve">- </w:t>
+      </w:r>
+      <w:proofErr w:type="spellStart"/>
+      <w:r>
+        <w:t>Whatsapp</w:t>
+      </w:r>
+      <w:proofErr w:type="spellEnd"/>
+      <w:r>
+        <w:t xml:space="preserve"> Group Call</w:t>
+      </w:r>
+      <w:r>
+        <w:br/>
+      </w:r>
+      <w:r>
+        <w:rPr>
+          <w:b/>
+          <w:bCs/>
+        </w:rPr>
+        <w:t>Attendance:</w:t>
+      </w:r>
+      <w:r>
+        <w:t xml:space="preserve"> All members present</w:t>
+      </w:r>
+    </w:p>
+    <w:p>
+      <w:pPr>
+        <w:spacing w:after="0"/>
+      </w:pPr>
+    </w:p>
+    <w:p>
+      <w:pPr>
+        <w:spacing w:after="0"/>
+      </w:pPr>
+      <w:r>
+        <w:rPr>
+          <w:b/>
+          <w:bCs/>
+          <w:u w:val="single"/>
+        </w:rPr>
+        <w:t>Agenda</w:t>
+      </w:r>
+      <w:r>
+        <w:rPr>
+          <w:b/>
+          <w:bCs/>
+        </w:rPr>
+        <w:br/>
+      </w:r>
+      <w:r>
+        <w:t>To complete</w:t>
+      </w:r>
+      <w:r>
+        <w:t xml:space="preserve"> part 1 to part 3 of </w:t>
       </w:r>
       <w:r>
         <w:t>d</w:t>
       </w:r>
       <w:r>
-        <w:t xml:space="preserve">, </w:t>
-      </w:r>
-      <w:r>
-        <w:t>2:</w:t>
-      </w:r>
-      <w:r>
-        <w:t>15</w:t>
-      </w:r>
-      <w:r>
-        <w:t xml:space="preserve"> PM – 4:</w:t>
-      </w:r>
-      <w:r>
-        <w:t>15</w:t>
-      </w:r>
-      <w:r>
-        <w:t xml:space="preserve"> PM</w:t>
-      </w:r>
-    </w:p>
-    <w:p>
-      <w:pPr>
-        <w:spacing w:after="0"/>
-      </w:pPr>
-      <w:r>
-        <w:rPr>
-          <w:b/>
-          <w:bCs/>
-        </w:rPr>
-        <w:t>Venue:</w:t>
-      </w:r>
-      <w:r>
-        <w:t xml:space="preserve"> </w:t>
-      </w:r>
-      <w:r>
-        <w:t>Virtual</w:t>
-      </w:r>
-      <w:r>
-        <w:t xml:space="preserve"> </w:t>
-      </w:r>
-      <w:r>
-        <w:t xml:space="preserve">- </w:t>
-      </w:r>
-      <w:proofErr w:type="spellStart"/>
-      <w:r>
-        <w:t>Whatsapp</w:t>
-      </w:r>
-      <w:proofErr w:type="spellEnd"/>
-      <w:r>
-        <w:t xml:space="preserve"> Group Call</w:t>
-      </w:r>
-      <w:r>
-        <w:br/>
-      </w:r>
-      <w:r>
-        <w:rPr>
-          <w:b/>
-          <w:bCs/>
-        </w:rPr>
-        <w:t>Atten</w:t>
-      </w:r>
-      <w:r>
-        <w:rPr>
-          <w:b/>
-          <w:bCs/>
-        </w:rPr>
-        <w:t>d</w:t>
-      </w:r>
-      <w:r>
-        <w:rPr>
-          <w:b/>
-          <w:bCs/>
-        </w:rPr>
-        <w:t>ance:</w:t>
-      </w:r>
-      <w:r>
-        <w:t xml:space="preserve"> All members present</w:t>
-      </w:r>
-    </w:p>
-    <w:p>
-      <w:pPr>
-        <w:spacing w:after="0"/>
-      </w:pPr>
-    </w:p>
-    <w:p>
-      <w:pPr>
-        <w:spacing w:after="0"/>
-      </w:pPr>
-      <w:r>
-        <w:rPr>
-          <w:b/>
-          <w:bCs/>
-          <w:u w:val="single"/>
-        </w:rPr>
-        <w:t>Agenda</w:t>
-      </w:r>
-      <w:r>
-        <w:rPr>
-          <w:b/>
-          <w:bCs/>
-        </w:rPr>
-        <w:br/>
-      </w:r>
-      <w:r>
-        <w:t>To complete</w:t>
-      </w:r>
-      <w:r>
-        <w:t xml:space="preserve"> </w:t>
-      </w:r>
-      <w:r>
-        <w:t>p</w:t>
-      </w:r>
-      <w:r>
-        <w:t>art 1</w:t>
-      </w:r>
-      <w:r>
-        <w:t xml:space="preserve"> to part </w:t>
-      </w:r>
-      <w:r>
-        <w:t xml:space="preserve">3 of </w:t>
-      </w:r>
-      <w:r>
-        <w:t>d</w:t>
-      </w:r>
-      <w:r>
-        <w:t>eliverable 1</w:t>
-      </w:r>
-      <w:r>
-        <w:t xml:space="preserve"> for our semester project</w:t>
-      </w:r>
-      <w:r>
-        <w:t>:</w:t>
+        <w:t>eliverable 1 for our semester project:</w:t>
       </w:r>
     </w:p>
     <w:p>
@@ -526,13 +431,7 @@
               <w:t xml:space="preserve">The meeting began. </w:t>
             </w:r>
             <w:r>
-              <w:t>We r</w:t>
-            </w:r>
-            <w:r>
-              <w:t>esearched and documented environmental growth requirements for the Carnation flower</w:t>
-            </w:r>
-            <w:r>
-              <w:t>.</w:t>
+              <w:t>We researched and documented environmental growth requirements for the Carnation flower.</w:t>
             </w:r>
           </w:p>
         </w:tc>
@@ -564,16 +463,7 @@
           </w:tcPr>
           <w:p>
             <w:r>
-              <w:t xml:space="preserve">We </w:t>
-            </w:r>
-            <w:r>
-              <w:t xml:space="preserve">listed </w:t>
-            </w:r>
-            <w:r>
-              <w:t>the</w:t>
-            </w:r>
-            <w:r>
-              <w:t xml:space="preserve"> required hardware components for the embedded monitoring device</w:t>
+              <w:t>We listed the required hardware components for the embedded monitoring device</w:t>
             </w:r>
             <w:r>
               <w:t>s from the list</w:t>
@@ -617,13 +507,7 @@
               <w:t>d</w:t>
             </w:r>
             <w:r>
-              <w:t xml:space="preserve"> feasible </w:t>
-            </w:r>
-            <w:r>
-              <w:t>prototyping tools</w:t>
-            </w:r>
-            <w:r>
-              <w:t xml:space="preserve"> an</w:t>
+              <w:t xml:space="preserve"> feasible prototyping tools an</w:t>
             </w:r>
             <w:r>
               <w:t>d</w:t>
@@ -833,13 +717,7 @@
         <w:t>Date:</w:t>
       </w:r>
       <w:r>
-        <w:t xml:space="preserve"> 0</w:t>
-      </w:r>
-      <w:r>
-        <w:t>4</w:t>
-      </w:r>
-      <w:r>
-        <w:t xml:space="preserve"> June 2026</w:t>
+        <w:t xml:space="preserve"> 04 June 2026</w:t>
       </w:r>
     </w:p>
     <w:p>
@@ -860,19 +738,7 @@
         <w:t>d</w:t>
       </w:r>
       <w:r>
-        <w:t xml:space="preserve">, </w:t>
-      </w:r>
-      <w:r>
-        <w:t>1</w:t>
-      </w:r>
-      <w:r>
-        <w:t xml:space="preserve">:15 PM – </w:t>
-      </w:r>
-      <w:r>
-        <w:t>3</w:t>
-      </w:r>
-      <w:r>
-        <w:t>:15 PM</w:t>
+        <w:t>, 1:15 PM – 3:15 PM</w:t>
       </w:r>
     </w:p>
     <w:p>
@@ -939,19 +805,13 @@
         <w:br/>
       </w:r>
       <w:r>
-        <w:t xml:space="preserve">To complete </w:t>
-      </w:r>
-      <w:r>
-        <w:t xml:space="preserve">the final part for </w:t>
+        <w:t xml:space="preserve">To complete the final part for </w:t>
       </w:r>
       <w:r>
         <w:t>d</w:t>
       </w:r>
       <w:r>
-        <w:t>eliverable</w:t>
-      </w:r>
-      <w:r>
-        <w:t xml:space="preserve"> 1 for our semester project:</w:t>
+        <w:t>eliverable 1 for our semester project:</w:t>
       </w:r>
     </w:p>
     <w:p>
@@ -1094,10 +954,7 @@
           </w:tcPr>
           <w:p>
             <w:r>
-              <w:t xml:space="preserve">The meeting began. We </w:t>
-            </w:r>
-            <w:r>
-              <w:t xml:space="preserve">split the schematic </w:t>
+              <w:t xml:space="preserve">The meeting began. We split the schematic </w:t>
             </w:r>
             <w:r>
               <w:t>d</w:t>
@@ -1329,6 +1186,679 @@
         </w:tc>
       </w:tr>
     </w:tbl>
+    <w:p/>
+    <w:p>
+      <w:pPr>
+        <w:spacing w:after="0"/>
+      </w:pPr>
+      <w:r>
+        <w:rPr>
+          <w:b/>
+          <w:bCs/>
+        </w:rPr>
+        <w:lastRenderedPageBreak/>
+        <w:t>Date:</w:t>
+      </w:r>
+      <w:r>
+        <w:t xml:space="preserve"> </w:t>
+      </w:r>
+      <w:r>
+        <w:t>1</w:t>
+      </w:r>
+      <w:r>
+        <w:t>4</w:t>
+      </w:r>
+      <w:r>
+        <w:t xml:space="preserve"> June 2026</w:t>
+      </w:r>
+    </w:p>
+    <w:p>
+      <w:pPr>
+        <w:spacing w:after="0"/>
+      </w:pPr>
+      <w:r>
+        <w:rPr>
+          <w:b/>
+          <w:bCs/>
+        </w:rPr>
+        <w:t>Time:</w:t>
+      </w:r>
+      <w:r>
+        <w:t xml:space="preserve"> </w:t>
+      </w:r>
+      <w:r>
+        <w:t>4</w:t>
+      </w:r>
+      <w:r>
+        <w:t>:</w:t>
+      </w:r>
+      <w:r>
+        <w:t>00</w:t>
+      </w:r>
+      <w:r>
+        <w:t xml:space="preserve"> PM – </w:t>
+      </w:r>
+      <w:r>
+        <w:t>5</w:t>
+      </w:r>
+      <w:r>
+        <w:t>:</w:t>
+      </w:r>
+      <w:r>
+        <w:t>00</w:t>
+      </w:r>
+      <w:r>
+        <w:t xml:space="preserve"> PM</w:t>
+      </w:r>
+    </w:p>
+    <w:p>
+      <w:pPr>
+        <w:spacing w:after="0"/>
+      </w:pPr>
+      <w:r>
+        <w:rPr>
+          <w:b/>
+          <w:bCs/>
+        </w:rPr>
+        <w:t>Venue:</w:t>
+      </w:r>
+      <w:r>
+        <w:t xml:space="preserve"> Virtual - </w:t>
+      </w:r>
+      <w:proofErr w:type="spellStart"/>
+      <w:r>
+        <w:t>Whatsapp</w:t>
+      </w:r>
+      <w:proofErr w:type="spellEnd"/>
+      <w:r>
+        <w:t xml:space="preserve"> Group Call</w:t>
+      </w:r>
+      <w:r>
+        <w:br/>
+      </w:r>
+      <w:r>
+        <w:rPr>
+          <w:b/>
+          <w:bCs/>
+        </w:rPr>
+        <w:t>Attendance:</w:t>
+      </w:r>
+      <w:r>
+        <w:t xml:space="preserve"> All members present</w:t>
+      </w:r>
+    </w:p>
+    <w:p>
+      <w:pPr>
+        <w:spacing w:after="0"/>
+      </w:pPr>
+    </w:p>
+    <w:p>
+      <w:pPr>
+        <w:spacing w:after="0"/>
+        <w:rPr>
+          <w:b/>
+          <w:bCs/>
+          <w:u w:val="single"/>
+        </w:rPr>
+      </w:pPr>
+      <w:r>
+        <w:rPr>
+          <w:b/>
+          <w:bCs/>
+          <w:u w:val="single"/>
+        </w:rPr>
+        <w:t>Agenda</w:t>
+      </w:r>
+    </w:p>
+    <w:p>
+      <w:pPr>
+        <w:pStyle w:val="ListParagraph"/>
+        <w:numPr>
+          <w:ilvl w:val="0"/>
+          <w:numId w:val="2"/>
+        </w:numPr>
+        <w:spacing w:after="0"/>
+      </w:pPr>
+      <w:r>
+        <w:t xml:space="preserve">To </w:t>
+      </w:r>
+      <w:r>
+        <w:t>go over CAT 2 Presentation Requirements</w:t>
+      </w:r>
+    </w:p>
+    <w:p>
+      <w:pPr>
+        <w:pStyle w:val="ListParagraph"/>
+        <w:numPr>
+          <w:ilvl w:val="0"/>
+          <w:numId w:val="2"/>
+        </w:numPr>
+        <w:spacing w:after="0"/>
+      </w:pPr>
+      <w:r>
+        <w:t>To create a presentation power</w:t>
+      </w:r>
+      <w:r>
+        <w:t>-</w:t>
+      </w:r>
+      <w:r>
+        <w:t>point</w:t>
+      </w:r>
+    </w:p>
+    <w:p>
+      <w:pPr>
+        <w:spacing w:after="0"/>
+        <w:rPr>
+          <w:u w:val="single"/>
+        </w:rPr>
+      </w:pPr>
+    </w:p>
+    <w:p>
+      <w:pPr>
+        <w:spacing w:after="0"/>
+        <w:rPr>
+          <w:b/>
+          <w:bCs/>
+          <w:u w:val="single"/>
+        </w:rPr>
+      </w:pPr>
+      <w:r>
+        <w:rPr>
+          <w:b/>
+          <w:bCs/>
+          <w:u w:val="single"/>
+        </w:rPr>
+        <w:t>Minutes</w:t>
+      </w:r>
+    </w:p>
+    <w:tbl>
+      <w:tblPr>
+        <w:tblStyle w:val="TableGrid"/>
+        <w:tblW w:w="0" w:type="auto"/>
+        <w:tblLook w:val="04A0" w:firstRow="1" w:lastRow="0" w:firstColumn="1" w:lastColumn="0" w:noHBand="0" w:noVBand="1"/>
+      </w:tblPr>
+      <w:tblGrid>
+        <w:gridCol w:w="1525"/>
+        <w:gridCol w:w="7825"/>
+      </w:tblGrid>
+      <w:tr>
+        <w:tc>
+          <w:tcPr>
+            <w:tcW w:w="1525" w:type="dxa"/>
+          </w:tcPr>
+          <w:p>
+            <w:pPr>
+              <w:rPr>
+                <w:b/>
+                <w:bCs/>
+              </w:rPr>
+            </w:pPr>
+            <w:r>
+              <w:rPr>
+                <w:b/>
+                <w:bCs/>
+              </w:rPr>
+              <w:t>Time</w:t>
+            </w:r>
+            <w:r>
+              <w:rPr>
+                <w:b/>
+                <w:bCs/>
+              </w:rPr>
+              <w:t xml:space="preserve"> (pm)</w:t>
+            </w:r>
+          </w:p>
+        </w:tc>
+        <w:tc>
+          <w:tcPr>
+            <w:tcW w:w="7825" w:type="dxa"/>
+          </w:tcPr>
+          <w:p>
+            <w:pPr>
+              <w:rPr>
+                <w:b/>
+                <w:bCs/>
+              </w:rPr>
+            </w:pPr>
+            <w:r>
+              <w:rPr>
+                <w:b/>
+                <w:bCs/>
+              </w:rPr>
+              <w:t>Activity</w:t>
+            </w:r>
+          </w:p>
+        </w:tc>
+      </w:tr>
+      <w:tr>
+        <w:tc>
+          <w:tcPr>
+            <w:tcW w:w="1525" w:type="dxa"/>
+          </w:tcPr>
+          <w:p>
+            <w:pPr>
+              <w:rPr>
+                <w:b/>
+                <w:bCs/>
+              </w:rPr>
+            </w:pPr>
+            <w:r>
+              <w:rPr>
+                <w:b/>
+                <w:bCs/>
+              </w:rPr>
+              <w:t>4</w:t>
+            </w:r>
+            <w:r>
+              <w:rPr>
+                <w:b/>
+                <w:bCs/>
+              </w:rPr>
+              <w:t>.</w:t>
+            </w:r>
+            <w:r>
+              <w:rPr>
+                <w:b/>
+                <w:bCs/>
+              </w:rPr>
+              <w:t>00</w:t>
+            </w:r>
+            <w:r>
+              <w:rPr>
+                <w:b/>
+                <w:bCs/>
+              </w:rPr>
+              <w:t xml:space="preserve"> – </w:t>
+            </w:r>
+            <w:r>
+              <w:rPr>
+                <w:b/>
+                <w:bCs/>
+              </w:rPr>
+              <w:t>4</w:t>
+            </w:r>
+            <w:r>
+              <w:rPr>
+                <w:b/>
+                <w:bCs/>
+              </w:rPr>
+              <w:t>.</w:t>
+            </w:r>
+            <w:r>
+              <w:rPr>
+                <w:b/>
+                <w:bCs/>
+              </w:rPr>
+              <w:t>2</w:t>
+            </w:r>
+            <w:r>
+              <w:rPr>
+                <w:b/>
+                <w:bCs/>
+              </w:rPr>
+              <w:t>0</w:t>
+            </w:r>
+          </w:p>
+        </w:tc>
+        <w:tc>
+          <w:tcPr>
+            <w:tcW w:w="7825" w:type="dxa"/>
+          </w:tcPr>
+          <w:p>
+            <w:r>
+              <w:t>The meeting began. We</w:t>
+            </w:r>
+            <w:r>
+              <w:t xml:space="preserve"> went over the CAT 2 </w:t>
+            </w:r>
+            <w:r>
+              <w:t>d</w:t>
+            </w:r>
+            <w:r>
+              <w:t>oc</w:t>
+            </w:r>
+            <w:r>
+              <w:t>.</w:t>
+            </w:r>
+          </w:p>
+        </w:tc>
+      </w:tr>
+      <w:tr>
+        <w:tc>
+          <w:tcPr>
+            <w:tcW w:w="1525" w:type="dxa"/>
+          </w:tcPr>
+          <w:p>
+            <w:pPr>
+              <w:rPr>
+                <w:b/>
+                <w:bCs/>
+              </w:rPr>
+            </w:pPr>
+            <w:r>
+              <w:rPr>
+                <w:b/>
+                <w:bCs/>
+              </w:rPr>
+              <w:t>4</w:t>
+            </w:r>
+            <w:r>
+              <w:rPr>
+                <w:b/>
+                <w:bCs/>
+              </w:rPr>
+              <w:t>.</w:t>
+            </w:r>
+            <w:r>
+              <w:rPr>
+                <w:b/>
+                <w:bCs/>
+              </w:rPr>
+              <w:t>20</w:t>
+            </w:r>
+            <w:r>
+              <w:rPr>
+                <w:b/>
+                <w:bCs/>
+              </w:rPr>
+              <w:t xml:space="preserve"> – </w:t>
+            </w:r>
+            <w:r>
+              <w:rPr>
+                <w:b/>
+                <w:bCs/>
+              </w:rPr>
+              <w:t>4</w:t>
+            </w:r>
+            <w:r>
+              <w:rPr>
+                <w:b/>
+                <w:bCs/>
+              </w:rPr>
+              <w:t>.</w:t>
+            </w:r>
+            <w:r>
+              <w:rPr>
+                <w:b/>
+                <w:bCs/>
+              </w:rPr>
+              <w:t>30</w:t>
+            </w:r>
+          </w:p>
+        </w:tc>
+        <w:tc>
+          <w:tcPr>
+            <w:tcW w:w="7825" w:type="dxa"/>
+          </w:tcPr>
+          <w:p>
+            <w:r>
+              <w:t>We create</w:t>
+            </w:r>
+            <w:r>
+              <w:t>d</w:t>
+            </w:r>
+            <w:r>
+              <w:t xml:space="preserve"> an action plan for the </w:t>
+            </w:r>
+            <w:proofErr w:type="spellStart"/>
+            <w:r>
+              <w:t>Mioty</w:t>
+            </w:r>
+            <w:proofErr w:type="spellEnd"/>
+            <w:r>
+              <w:t xml:space="preserve"> an</w:t>
+            </w:r>
+            <w:r>
+              <w:t>d</w:t>
+            </w:r>
+            <w:r>
+              <w:t xml:space="preserve"> BLE architecture break</w:t>
+            </w:r>
+            <w:r>
+              <w:t>d</w:t>
+            </w:r>
+            <w:r>
+              <w:t>own</w:t>
+            </w:r>
+          </w:p>
+        </w:tc>
+      </w:tr>
+      <w:tr>
+        <w:tc>
+          <w:tcPr>
+            <w:tcW w:w="1525" w:type="dxa"/>
+          </w:tcPr>
+          <w:p>
+            <w:pPr>
+              <w:rPr>
+                <w:b/>
+                <w:bCs/>
+              </w:rPr>
+            </w:pPr>
+            <w:r>
+              <w:rPr>
+                <w:b/>
+                <w:bCs/>
+              </w:rPr>
+              <w:t>4.</w:t>
+            </w:r>
+            <w:r>
+              <w:rPr>
+                <w:b/>
+                <w:bCs/>
+              </w:rPr>
+              <w:t>3</w:t>
+            </w:r>
+            <w:r>
+              <w:rPr>
+                <w:b/>
+                <w:bCs/>
+              </w:rPr>
+              <w:t>0</w:t>
+            </w:r>
+            <w:r>
+              <w:rPr>
+                <w:b/>
+                <w:bCs/>
+              </w:rPr>
+              <w:t xml:space="preserve"> – </w:t>
+            </w:r>
+            <w:r>
+              <w:rPr>
+                <w:b/>
+                <w:bCs/>
+              </w:rPr>
+              <w:t>4</w:t>
+            </w:r>
+            <w:r>
+              <w:rPr>
+                <w:b/>
+                <w:bCs/>
+              </w:rPr>
+              <w:t>.</w:t>
+            </w:r>
+            <w:r>
+              <w:rPr>
+                <w:b/>
+                <w:bCs/>
+              </w:rPr>
+              <w:t>4</w:t>
+            </w:r>
+            <w:r>
+              <w:rPr>
+                <w:b/>
+                <w:bCs/>
+              </w:rPr>
+              <w:t>0</w:t>
+            </w:r>
+          </w:p>
+        </w:tc>
+        <w:tc>
+          <w:tcPr>
+            <w:tcW w:w="7825" w:type="dxa"/>
+          </w:tcPr>
+          <w:p>
+            <w:r>
+              <w:t>Members agree</w:t>
+            </w:r>
+            <w:r>
+              <w:t>d</w:t>
+            </w:r>
+            <w:r>
+              <w:t xml:space="preserve"> to analyze the architectures per </w:t>
+            </w:r>
+            <w:proofErr w:type="spellStart"/>
+            <w:r>
+              <w:t>lec’s</w:t>
+            </w:r>
+            <w:proofErr w:type="spellEnd"/>
+            <w:r>
+              <w:t xml:space="preserve"> requirements</w:t>
+            </w:r>
+          </w:p>
+        </w:tc>
+      </w:tr>
+      <w:tr>
+        <w:tc>
+          <w:tcPr>
+            <w:tcW w:w="1525" w:type="dxa"/>
+          </w:tcPr>
+          <w:p>
+            <w:pPr>
+              <w:rPr>
+                <w:b/>
+                <w:bCs/>
+              </w:rPr>
+            </w:pPr>
+            <w:r>
+              <w:rPr>
+                <w:b/>
+                <w:bCs/>
+              </w:rPr>
+              <w:t>4.40 – 4.50</w:t>
+            </w:r>
+          </w:p>
+        </w:tc>
+        <w:tc>
+          <w:tcPr>
+            <w:tcW w:w="7825" w:type="dxa"/>
+          </w:tcPr>
+          <w:p>
+            <w:r>
+              <w:t xml:space="preserve">We </w:t>
+            </w:r>
+            <w:r>
+              <w:t>d</w:t>
+            </w:r>
+            <w:r>
+              <w:t>iscusse</w:t>
+            </w:r>
+            <w:r>
+              <w:t>d</w:t>
+            </w:r>
+            <w:r>
+              <w:t xml:space="preserve"> creative ways to present </w:t>
+            </w:r>
+          </w:p>
+        </w:tc>
+      </w:tr>
+      <w:tr>
+        <w:tc>
+          <w:tcPr>
+            <w:tcW w:w="1525" w:type="dxa"/>
+          </w:tcPr>
+          <w:p>
+            <w:pPr>
+              <w:rPr>
+                <w:b/>
+                <w:bCs/>
+              </w:rPr>
+            </w:pPr>
+            <w:r>
+              <w:rPr>
+                <w:b/>
+                <w:bCs/>
+              </w:rPr>
+              <w:t>4.50 – 5.00</w:t>
+            </w:r>
+          </w:p>
+        </w:tc>
+        <w:tc>
+          <w:tcPr>
+            <w:tcW w:w="7825" w:type="dxa"/>
+          </w:tcPr>
+          <w:p>
+            <w:r>
+              <w:t>We conclu</w:t>
+            </w:r>
+            <w:r>
+              <w:t>d</w:t>
+            </w:r>
+            <w:r>
+              <w:t>e</w:t>
+            </w:r>
+            <w:r>
+              <w:t>d</w:t>
+            </w:r>
+            <w:r>
+              <w:t xml:space="preserve"> an</w:t>
+            </w:r>
+            <w:r>
+              <w:t>d</w:t>
+            </w:r>
+            <w:r>
+              <w:t xml:space="preserve"> agree</w:t>
+            </w:r>
+            <w:r>
+              <w:t>d</w:t>
+            </w:r>
+            <w:r>
+              <w:t xml:space="preserve"> to meet </w:t>
+            </w:r>
+            <w:proofErr w:type="gramStart"/>
+            <w:r>
+              <w:t xml:space="preserve">next </w:t>
+            </w:r>
+            <w:r>
+              <w:t xml:space="preserve"> on</w:t>
+            </w:r>
+            <w:proofErr w:type="gramEnd"/>
+            <w:r>
+              <w:t xml:space="preserve"> 18</w:t>
+            </w:r>
+            <w:r>
+              <w:rPr>
+                <w:vertAlign w:val="superscript"/>
+              </w:rPr>
+              <w:t>th</w:t>
+            </w:r>
+            <w:r>
+              <w:t xml:space="preserve"> June 2026.</w:t>
+            </w:r>
+          </w:p>
+        </w:tc>
+      </w:tr>
+    </w:tbl>
+    <w:p>
+      <w:pPr>
+        <w:rPr>
+          <w:b/>
+          <w:bCs/>
+        </w:rPr>
+      </w:pPr>
+    </w:p>
+    <w:p>
+      <w:r>
+        <w:rPr>
+          <w:b/>
+          <w:bCs/>
+        </w:rPr>
+        <w:t>_____________________________________________________________________________________</w:t>
+      </w:r>
+      <w:r>
+        <w:br w:type="page"/>
+      </w:r>
+    </w:p>
     <w:p/>
     <w:sectPr>
       <w:type w:val="continuous"/>
@@ -1429,8 +1959,97 @@
       </w:pPr>
     </w:lvl>
   </w:abstractNum>
+  <w:abstractNum w:abstractNumId="1" w15:restartNumberingAfterBreak="0">
+    <w:nsid w:val="651B12B3"/>
+    <w:multiLevelType w:val="hybridMultilevel"/>
+    <w:tmpl w:val="0E3C84DE"/>
+    <w:lvl w:ilvl="0" w:tplc="0409000F">
+      <w:start w:val="1"/>
+      <w:numFmt w:val="decimal"/>
+      <w:lvlText w:val="%1."/>
+      <w:lvlJc w:val="left"/>
+      <w:pPr>
+        <w:ind w:left="720" w:hanging="360"/>
+      </w:pPr>
+    </w:lvl>
+    <w:lvl w:ilvl="1" w:tplc="04090019" w:tentative="1">
+      <w:start w:val="1"/>
+      <w:numFmt w:val="lowerLetter"/>
+      <w:lvlText w:val="%2."/>
+      <w:lvlJc w:val="left"/>
+      <w:pPr>
+        <w:ind w:left="1440" w:hanging="360"/>
+      </w:pPr>
+    </w:lvl>
+    <w:lvl w:ilvl="2" w:tplc="0409001B" w:tentative="1">
+      <w:start w:val="1"/>
+      <w:numFmt w:val="lowerRoman"/>
+      <w:lvlText w:val="%3."/>
+      <w:lvlJc w:val="right"/>
+      <w:pPr>
+        <w:ind w:left="2160" w:hanging="180"/>
+      </w:pPr>
+    </w:lvl>
+    <w:lvl w:ilvl="3" w:tplc="0409000F" w:tentative="1">
+      <w:start w:val="1"/>
+      <w:numFmt w:val="decimal"/>
+      <w:lvlText w:val="%4."/>
+      <w:lvlJc w:val="left"/>
+      <w:pPr>
+        <w:ind w:left="2880" w:hanging="360"/>
+      </w:pPr>
+    </w:lvl>
+    <w:lvl w:ilvl="4" w:tplc="04090019" w:tentative="1">
+      <w:start w:val="1"/>
+      <w:numFmt w:val="lowerLetter"/>
+      <w:lvlText w:val="%5."/>
+      <w:lvlJc w:val="left"/>
+      <w:pPr>
+        <w:ind w:left="3600" w:hanging="360"/>
+      </w:pPr>
+    </w:lvl>
+    <w:lvl w:ilvl="5" w:tplc="0409001B" w:tentative="1">
+      <w:start w:val="1"/>
+      <w:numFmt w:val="lowerRoman"/>
+      <w:lvlText w:val="%6."/>
+      <w:lvlJc w:val="right"/>
+      <w:pPr>
+        <w:ind w:left="4320" w:hanging="180"/>
+      </w:pPr>
+    </w:lvl>
+    <w:lvl w:ilvl="6" w:tplc="0409000F" w:tentative="1">
+      <w:start w:val="1"/>
+      <w:numFmt w:val="decimal"/>
+      <w:lvlText w:val="%7."/>
+      <w:lvlJc w:val="left"/>
+      <w:pPr>
+        <w:ind w:left="5040" w:hanging="360"/>
+      </w:pPr>
+    </w:lvl>
+    <w:lvl w:ilvl="7" w:tplc="04090019" w:tentative="1">
+      <w:start w:val="1"/>
+      <w:numFmt w:val="lowerLetter"/>
+      <w:lvlText w:val="%8."/>
+      <w:lvlJc w:val="left"/>
+      <w:pPr>
+        <w:ind w:left="5760" w:hanging="360"/>
+      </w:pPr>
+    </w:lvl>
+    <w:lvl w:ilvl="8" w:tplc="0409001B" w:tentative="1">
+      <w:start w:val="1"/>
+      <w:numFmt w:val="lowerRoman"/>
+      <w:lvlText w:val="%9."/>
+      <w:lvlJc w:val="right"/>
+      <w:pPr>
+        <w:ind w:left="6480" w:hanging="180"/>
+      </w:pPr>
+    </w:lvl>
+  </w:abstractNum>
   <w:num w:numId="1">
     <w:abstractNumId w:val="0"/>
+  </w:num>
+  <w:num w:numId="2">
+    <w:abstractNumId w:val="1"/>
   </w:num>
 </w:numbering>
 </file>
@@ -1833,7 +2452,7 @@
   <w:style w:type="paragraph" w:default="1" w:styleId="Normal">
     <w:name w:val="Normal"/>
     <w:qFormat/>
-    <w:rsid w:val="00533688"/>
+    <w:rsid w:val="007E7F87"/>
   </w:style>
   <w:style w:type="character" w:default="1" w:styleId="DefaultParagraphFont">
     <w:name w:val="Default Paragraph Font"/>

</xml_diff>

<commit_message>
update doc with deliverable 3 group work evidence
</commit_message>
<xml_diff>
--- a/IoT_grp9_Meeting_Minutes.docx
+++ b/IoT_grp9_Meeting_Minutes.docx
@@ -1,6 +1,6 @@
 
 <file path=word/document.xml><?xml version="1.0" encoding="utf-8"?>
-<w:document xmlns:wpc="http://schemas.microsoft.com/office/word/2010/wordprocessingCanvas" xmlns:cx="http://schemas.microsoft.com/office/drawing/2014/chartex" xmlns:cx1="http://schemas.microsoft.com/office/drawing/2015/9/8/chartex" xmlns:cx2="http://schemas.microsoft.com/office/drawing/2015/10/21/chartex" xmlns:cx3="http://schemas.microsoft.com/office/drawing/2016/5/9/chartex" xmlns:cx4="http://schemas.microsoft.com/office/drawing/2016/5/10/chartex" xmlns:cx5="http://schemas.microsoft.com/office/drawing/2016/5/11/chartex" xmlns:cx6="http://schemas.microsoft.com/office/drawing/2016/5/12/chartex" xmlns:cx7="http://schemas.microsoft.com/office/drawing/2016/5/13/chartex" xmlns:cx8="http://schemas.microsoft.com/office/drawing/2016/5/14/chartex" xmlns:mc="http://schemas.openxmlformats.org/markup-compatibility/2006" xmlns:aink="http://schemas.microsoft.com/office/drawing/2016/ink" xmlns:am3d="http://schemas.microsoft.com/office/drawing/2017/model3d" xmlns:o="urn:schemas-microsoft-com:office:office" xmlns:r="http://schemas.openxmlformats.org/officeDocument/2006/relationships" xmlns:m="http://schemas.openxmlformats.org/officeDocument/2006/math" xmlns:v="urn:schemas-microsoft-com:vml" xmlns:wp14="http://schemas.microsoft.com/office/word/2010/wordprocessingDrawing" xmlns:wp="http://schemas.openxmlformats.org/drawingml/2006/wordprocessingDrawing" xmlns:w10="urn:schemas-microsoft-com:office:word" xmlns:w="http://schemas.openxmlformats.org/wordprocessingml/2006/main" xmlns:w14="http://schemas.microsoft.com/office/word/2010/wordml" xmlns:w15="http://schemas.microsoft.com/office/word/2012/wordml" xmlns:w16cex="http://schemas.microsoft.com/office/word/2018/wordml/cex" xmlns:w16cid="http://schemas.microsoft.com/office/word/2016/wordml/cid" xmlns:w16="http://schemas.microsoft.com/office/word/2018/wordml" xmlns:w16sdtdh="http://schemas.microsoft.com/office/word/2020/wordml/sdtdatahash" xmlns:w16se="http://schemas.microsoft.com/office/word/2015/wordml/symex" xmlns:wpg="http://schemas.microsoft.com/office/word/2010/wordprocessingGroup" xmlns:wpi="http://schemas.microsoft.com/office/word/2010/wordprocessingInk" xmlns:wne="http://schemas.microsoft.com/office/word/2006/wordml" xmlns:wps="http://schemas.microsoft.com/office/word/2010/wordprocessingShape" mc:Ignorable="w14 w15 w16se w16cid w16 w16cex w16sdtdh wp14">
+<w:document xmlns:wpc="http://schemas.microsoft.com/office/word/2010/wordprocessingCanvas" xmlns:cx="http://schemas.microsoft.com/office/drawing/2014/chartex" xmlns:cx1="http://schemas.microsoft.com/office/drawing/2015/9/8/chartex" xmlns:cx2="http://schemas.microsoft.com/office/drawing/2015/10/21/chartex" xmlns:cx3="http://schemas.microsoft.com/office/drawing/2016/5/9/chartex" xmlns:cx4="http://schemas.microsoft.com/office/drawing/2016/5/10/chartex" xmlns:cx5="http://schemas.microsoft.com/office/drawing/2016/5/11/chartex" xmlns:cx6="http://schemas.microsoft.com/office/drawing/2016/5/12/chartex" xmlns:cx7="http://schemas.microsoft.com/office/drawing/2016/5/13/chartex" xmlns:cx8="http://schemas.microsoft.com/office/drawing/2016/5/14/chartex" xmlns:mc="http://schemas.openxmlformats.org/markup-compatibility/2006" xmlns:aink="http://schemas.microsoft.com/office/drawing/2016/ink" xmlns:am3d="http://schemas.microsoft.com/office/drawing/2017/model3d" xmlns:o="urn:schemas-microsoft-com:office:office" xmlns:oel="http://schemas.microsoft.com/office/2019/extlst" xmlns:r="http://schemas.openxmlformats.org/officeDocument/2006/relationships" xmlns:m="http://schemas.openxmlformats.org/officeDocument/2006/math" xmlns:v="urn:schemas-microsoft-com:vml" xmlns:wp14="http://schemas.microsoft.com/office/word/2010/wordprocessingDrawing" xmlns:wp="http://schemas.openxmlformats.org/drawingml/2006/wordprocessingDrawing" xmlns:w10="urn:schemas-microsoft-com:office:word" xmlns:w="http://schemas.openxmlformats.org/wordprocessingml/2006/main" xmlns:w14="http://schemas.microsoft.com/office/word/2010/wordml" xmlns:w15="http://schemas.microsoft.com/office/word/2012/wordml" xmlns:w16cex="http://schemas.microsoft.com/office/word/2018/wordml/cex" xmlns:w16cid="http://schemas.microsoft.com/office/word/2016/wordml/cid" xmlns:w16="http://schemas.microsoft.com/office/word/2018/wordml" xmlns:w16du="http://schemas.microsoft.com/office/word/2023/wordml/word16du" xmlns:w16sdtdh="http://schemas.microsoft.com/office/word/2020/wordml/sdtdatahash" xmlns:w16sdtfl="http://schemas.microsoft.com/office/word/2024/wordml/sdtformatlock" xmlns:w16se="http://schemas.microsoft.com/office/word/2015/wordml/symex" xmlns:wpg="http://schemas.microsoft.com/office/word/2010/wordprocessingGroup" xmlns:wpi="http://schemas.microsoft.com/office/word/2010/wordprocessingInk" xmlns:wne="http://schemas.microsoft.com/office/word/2006/wordml" xmlns:wps="http://schemas.microsoft.com/office/word/2010/wordprocessingShape" mc:Ignorable="w14 w15 w16se w16cid w16 w16cex w16sdtdh w16sdtfl w16du wp14">
   <w:body>
     <w:p>
       <w:pPr>
@@ -75,15 +75,7 @@
         </w:numPr>
       </w:pPr>
       <w:r>
-        <w:t xml:space="preserve">Caleb </w:t>
-      </w:r>
-      <w:proofErr w:type="spellStart"/>
-      <w:r>
-        <w:t>Kipchirchir</w:t>
-      </w:r>
-      <w:proofErr w:type="spellEnd"/>
-      <w:r>
-        <w:t xml:space="preserve"> - 169391 </w:t>
+        <w:t xml:space="preserve">Caleb Kipchirchir - 169391 </w:t>
       </w:r>
     </w:p>
     <w:p>
@@ -119,15 +111,7 @@
         </w:numPr>
       </w:pPr>
       <w:r>
-        <w:t xml:space="preserve">Dennis </w:t>
-      </w:r>
-      <w:proofErr w:type="spellStart"/>
-      <w:r>
-        <w:t>Kyalo</w:t>
-      </w:r>
-      <w:proofErr w:type="spellEnd"/>
-      <w:r>
-        <w:t xml:space="preserve"> - 158270</w:t>
+        <w:t>Dennis Kyalo - 158270</w:t>
       </w:r>
     </w:p>
     <w:p>
@@ -1845,21 +1829,7 @@
           <w:bCs/>
         </w:rPr>
         <w:lastRenderedPageBreak/>
-        <w:t>Lab Meeting Photo Evi</w:t>
-      </w:r>
-      <w:r>
-        <w:rPr>
-          <w:b/>
-          <w:bCs/>
-        </w:rPr>
-        <w:t>d</w:t>
-      </w:r>
-      <w:r>
-        <w:rPr>
-          <w:b/>
-          <w:bCs/>
-        </w:rPr>
-        <w:t>ence</w:t>
+        <w:t>Lab Meeting Photo Evidence</w:t>
       </w:r>
     </w:p>
     <w:tbl>
@@ -2140,6 +2110,118 @@
           </w:p>
         </w:tc>
       </w:tr>
+      <w:tr>
+        <w:trPr>
+          <w:trHeight w:val="3743"/>
+        </w:trPr>
+        <w:tc>
+          <w:tcPr>
+            <w:tcW w:w="5049" w:type="dxa"/>
+            <w:vAlign w:val="center"/>
+          </w:tcPr>
+          <w:p>
+            <w:pPr>
+              <w:jc w:val="center"/>
+              <w:rPr>
+                <w:b/>
+                <w:bCs/>
+              </w:rPr>
+            </w:pPr>
+            <w:r>
+              <w:rPr>
+                <w:b/>
+                <w:bCs/>
+              </w:rPr>
+              <w:t>09/07/2026</w:t>
+            </w:r>
+          </w:p>
+        </w:tc>
+        <w:tc>
+          <w:tcPr>
+            <w:tcW w:w="5049" w:type="dxa"/>
+            <w:vAlign w:val="center"/>
+          </w:tcPr>
+          <w:p>
+            <w:pPr>
+              <w:jc w:val="center"/>
+              <w:rPr>
+                <w:b/>
+                <w:bCs/>
+                <w:noProof/>
+              </w:rPr>
+            </w:pPr>
+            <w:r>
+              <w:rPr>
+                <w:b/>
+                <w:bCs/>
+                <w:noProof/>
+              </w:rPr>
+              <w:drawing>
+                <wp:anchor distT="0" distB="0" distL="114300" distR="114300" simplePos="0" relativeHeight="251660288" behindDoc="0" locked="0" layoutInCell="1" allowOverlap="1" wp14:anchorId="0F31D9FA" wp14:editId="00B109F1">
+                  <wp:simplePos x="0" y="0"/>
+                  <wp:positionH relativeFrom="column">
+                    <wp:posOffset>57785</wp:posOffset>
+                  </wp:positionH>
+                  <wp:positionV relativeFrom="paragraph">
+                    <wp:posOffset>34925</wp:posOffset>
+                  </wp:positionV>
+                  <wp:extent cx="2877185" cy="1619250"/>
+                  <wp:effectExtent l="0" t="0" r="0" b="0"/>
+                  <wp:wrapNone/>
+                  <wp:docPr id="1965715092" name="Picture 1"/>
+                  <wp:cNvGraphicFramePr>
+                    <a:graphicFrameLocks xmlns:a="http://schemas.openxmlformats.org/drawingml/2006/main" noChangeAspect="1"/>
+                  </wp:cNvGraphicFramePr>
+                  <a:graphic xmlns:a="http://schemas.openxmlformats.org/drawingml/2006/main">
+                    <a:graphicData uri="http://schemas.openxmlformats.org/drawingml/2006/picture">
+                      <pic:pic xmlns:pic="http://schemas.openxmlformats.org/drawingml/2006/picture">
+                        <pic:nvPicPr>
+                          <pic:cNvPr id="0" name="Picture 1"/>
+                          <pic:cNvPicPr>
+                            <a:picLocks noChangeAspect="1" noChangeArrowheads="1"/>
+                          </pic:cNvPicPr>
+                        </pic:nvPicPr>
+                        <pic:blipFill>
+                          <a:blip r:embed="rId7" cstate="print">
+                            <a:extLst>
+                              <a:ext uri="{28A0092B-C50C-407E-A947-70E740481C1C}">
+                                <a14:useLocalDpi xmlns:a14="http://schemas.microsoft.com/office/drawing/2010/main" val="0"/>
+                              </a:ext>
+                            </a:extLst>
+                          </a:blip>
+                          <a:srcRect/>
+                          <a:stretch>
+                            <a:fillRect/>
+                          </a:stretch>
+                        </pic:blipFill>
+                        <pic:spPr bwMode="auto">
+                          <a:xfrm>
+                            <a:off x="0" y="0"/>
+                            <a:ext cx="2877185" cy="1619250"/>
+                          </a:xfrm>
+                          <a:prstGeom prst="rect">
+                            <a:avLst/>
+                          </a:prstGeom>
+                          <a:noFill/>
+                          <a:ln>
+                            <a:noFill/>
+                          </a:ln>
+                        </pic:spPr>
+                      </pic:pic>
+                    </a:graphicData>
+                  </a:graphic>
+                  <wp14:sizeRelH relativeFrom="margin">
+                    <wp14:pctWidth>0</wp14:pctWidth>
+                  </wp14:sizeRelH>
+                  <wp14:sizeRelV relativeFrom="margin">
+                    <wp14:pctHeight>0</wp14:pctHeight>
+                  </wp14:sizeRelV>
+                </wp:anchor>
+              </w:drawing>
+            </w:r>
+          </w:p>
+        </w:tc>
+      </w:tr>
     </w:tbl>
     <w:p/>
     <w:sectPr>
@@ -2154,7 +2236,7 @@
 </file>
 
 <file path=word/numbering.xml><?xml version="1.0" encoding="utf-8"?>
-<w:numbering xmlns:wpc="http://schemas.microsoft.com/office/word/2010/wordprocessingCanvas" xmlns:cx="http://schemas.microsoft.com/office/drawing/2014/chartex" xmlns:cx1="http://schemas.microsoft.com/office/drawing/2015/9/8/chartex" xmlns:cx2="http://schemas.microsoft.com/office/drawing/2015/10/21/chartex" xmlns:cx3="http://schemas.microsoft.com/office/drawing/2016/5/9/chartex" xmlns:cx4="http://schemas.microsoft.com/office/drawing/2016/5/10/chartex" xmlns:cx5="http://schemas.microsoft.com/office/drawing/2016/5/11/chartex" xmlns:cx6="http://schemas.microsoft.com/office/drawing/2016/5/12/chartex" xmlns:cx7="http://schemas.microsoft.com/office/drawing/2016/5/13/chartex" xmlns:cx8="http://schemas.microsoft.com/office/drawing/2016/5/14/chartex" xmlns:mc="http://schemas.openxmlformats.org/markup-compatibility/2006" xmlns:aink="http://schemas.microsoft.com/office/drawing/2016/ink" xmlns:am3d="http://schemas.microsoft.com/office/drawing/2017/model3d" xmlns:o="urn:schemas-microsoft-com:office:office" xmlns:r="http://schemas.openxmlformats.org/officeDocument/2006/relationships" xmlns:m="http://schemas.openxmlformats.org/officeDocument/2006/math" xmlns:v="urn:schemas-microsoft-com:vml" xmlns:wp14="http://schemas.microsoft.com/office/word/2010/wordprocessingDrawing" xmlns:wp="http://schemas.openxmlformats.org/drawingml/2006/wordprocessingDrawing" xmlns:w10="urn:schemas-microsoft-com:office:word" xmlns:w="http://schemas.openxmlformats.org/wordprocessingml/2006/main" xmlns:w14="http://schemas.microsoft.com/office/word/2010/wordml" xmlns:w15="http://schemas.microsoft.com/office/word/2012/wordml" xmlns:w16cex="http://schemas.microsoft.com/office/word/2018/wordml/cex" xmlns:w16cid="http://schemas.microsoft.com/office/word/2016/wordml/cid" xmlns:w16="http://schemas.microsoft.com/office/word/2018/wordml" xmlns:w16sdtdh="http://schemas.microsoft.com/office/word/2020/wordml/sdtdatahash" xmlns:w16se="http://schemas.microsoft.com/office/word/2015/wordml/symex" xmlns:wpg="http://schemas.microsoft.com/office/word/2010/wordprocessingGroup" xmlns:wpi="http://schemas.microsoft.com/office/word/2010/wordprocessingInk" xmlns:wne="http://schemas.microsoft.com/office/word/2006/wordml" xmlns:wps="http://schemas.microsoft.com/office/word/2010/wordprocessingShape" mc:Ignorable="w14 w15 w16se w16cid w16 w16cex w16sdtdh wp14">
+<w:numbering xmlns:wpc="http://schemas.microsoft.com/office/word/2010/wordprocessingCanvas" xmlns:cx="http://schemas.microsoft.com/office/drawing/2014/chartex" xmlns:cx1="http://schemas.microsoft.com/office/drawing/2015/9/8/chartex" xmlns:cx2="http://schemas.microsoft.com/office/drawing/2015/10/21/chartex" xmlns:cx3="http://schemas.microsoft.com/office/drawing/2016/5/9/chartex" xmlns:cx4="http://schemas.microsoft.com/office/drawing/2016/5/10/chartex" xmlns:cx5="http://schemas.microsoft.com/office/drawing/2016/5/11/chartex" xmlns:cx6="http://schemas.microsoft.com/office/drawing/2016/5/12/chartex" xmlns:cx7="http://schemas.microsoft.com/office/drawing/2016/5/13/chartex" xmlns:cx8="http://schemas.microsoft.com/office/drawing/2016/5/14/chartex" xmlns:mc="http://schemas.openxmlformats.org/markup-compatibility/2006" xmlns:aink="http://schemas.microsoft.com/office/drawing/2016/ink" xmlns:am3d="http://schemas.microsoft.com/office/drawing/2017/model3d" xmlns:o="urn:schemas-microsoft-com:office:office" xmlns:oel="http://schemas.microsoft.com/office/2019/extlst" xmlns:r="http://schemas.openxmlformats.org/officeDocument/2006/relationships" xmlns:m="http://schemas.openxmlformats.org/officeDocument/2006/math" xmlns:v="urn:schemas-microsoft-com:vml" xmlns:wp14="http://schemas.microsoft.com/office/word/2010/wordprocessingDrawing" xmlns:wp="http://schemas.openxmlformats.org/drawingml/2006/wordprocessingDrawing" xmlns:w10="urn:schemas-microsoft-com:office:word" xmlns:w="http://schemas.openxmlformats.org/wordprocessingml/2006/main" xmlns:w14="http://schemas.microsoft.com/office/word/2010/wordml" xmlns:w15="http://schemas.microsoft.com/office/word/2012/wordml" xmlns:w16cex="http://schemas.microsoft.com/office/word/2018/wordml/cex" xmlns:w16cid="http://schemas.microsoft.com/office/word/2016/wordml/cid" xmlns:w16="http://schemas.microsoft.com/office/word/2018/wordml" xmlns:w16du="http://schemas.microsoft.com/office/word/2023/wordml/word16du" xmlns:w16sdtdh="http://schemas.microsoft.com/office/word/2020/wordml/sdtdatahash" xmlns:w16sdtfl="http://schemas.microsoft.com/office/word/2024/wordml/sdtformatlock" xmlns:w16se="http://schemas.microsoft.com/office/word/2015/wordml/symex" xmlns:wpg="http://schemas.microsoft.com/office/word/2010/wordprocessingGroup" xmlns:wpi="http://schemas.microsoft.com/office/word/2010/wordprocessingInk" xmlns:wne="http://schemas.microsoft.com/office/word/2006/wordml" xmlns:wps="http://schemas.microsoft.com/office/word/2010/wordprocessingShape" mc:Ignorable="w14 w15 w16se w16cid w16 w16cex w16sdtdh w16sdtfl w16du wp14">
   <w:abstractNum w:abstractNumId="0" w15:restartNumberingAfterBreak="0">
     <w:nsid w:val="3613457C"/>
     <w:multiLevelType w:val="hybridMultilevel"/>
@@ -2327,17 +2409,17 @@
       </w:pPr>
     </w:lvl>
   </w:abstractNum>
-  <w:num w:numId="1">
+  <w:num w:numId="1" w16cid:durableId="170534483">
     <w:abstractNumId w:val="0"/>
   </w:num>
-  <w:num w:numId="2">
+  <w:num w:numId="2" w16cid:durableId="2044093203">
     <w:abstractNumId w:val="1"/>
   </w:num>
 </w:numbering>
 </file>
 
 <file path=word/styles.xml><?xml version="1.0" encoding="utf-8"?>
-<w:styles xmlns:mc="http://schemas.openxmlformats.org/markup-compatibility/2006" xmlns:r="http://schemas.openxmlformats.org/officeDocument/2006/relationships" xmlns:w="http://schemas.openxmlformats.org/wordprocessingml/2006/main" xmlns:w14="http://schemas.microsoft.com/office/word/2010/wordml" xmlns:w15="http://schemas.microsoft.com/office/word/2012/wordml" xmlns:w16cex="http://schemas.microsoft.com/office/word/2018/wordml/cex" xmlns:w16cid="http://schemas.microsoft.com/office/word/2016/wordml/cid" xmlns:w16="http://schemas.microsoft.com/office/word/2018/wordml" xmlns:w16sdtdh="http://schemas.microsoft.com/office/word/2020/wordml/sdtdatahash" xmlns:w16se="http://schemas.microsoft.com/office/word/2015/wordml/symex" mc:Ignorable="w14 w15 w16se w16cid w16 w16cex w16sdtdh">
+<w:styles xmlns:mc="http://schemas.openxmlformats.org/markup-compatibility/2006" xmlns:r="http://schemas.openxmlformats.org/officeDocument/2006/relationships" xmlns:w="http://schemas.openxmlformats.org/wordprocessingml/2006/main" xmlns:w14="http://schemas.microsoft.com/office/word/2010/wordml" xmlns:w15="http://schemas.microsoft.com/office/word/2012/wordml" xmlns:w16cex="http://schemas.microsoft.com/office/word/2018/wordml/cex" xmlns:w16cid="http://schemas.microsoft.com/office/word/2016/wordml/cid" xmlns:w16="http://schemas.microsoft.com/office/word/2018/wordml" xmlns:w16du="http://schemas.microsoft.com/office/word/2023/wordml/word16du" xmlns:w16sdtdh="http://schemas.microsoft.com/office/word/2020/wordml/sdtdatahash" xmlns:w16sdtfl="http://schemas.microsoft.com/office/word/2024/wordml/sdtformatlock" xmlns:w16se="http://schemas.microsoft.com/office/word/2015/wordml/symex" mc:Ignorable="w14 w15 w16se w16cid w16 w16cex w16sdtdh w16sdtfl w16du">
   <w:docDefaults>
     <w:rPrDefault>
       <w:rPr>

</xml_diff>